<commit_message>
court(idahoctapp): opening-brief latex gated, the seven-line heading kept whole by the model's heading keep (fb-595.54.76)
Co-Authored-By: Claude Opus 5.5 <noreply@anthropic.com>
</commit_message>
<xml_diff>
--- a/courts/ninth-circuit/idaho/state/court-of-appeals/opening-brief/usage/OUTPUT-opening-brief.docx
+++ b/courts/ninth-circuit/idaho/state/court-of-appeals/opening-brief/usage/OUTPUT-opening-brief.docx
@@ -9157,6 +9157,33 @@
     <w:pPr>
       <w:spacing w:before="0" w:after="0" w:line="322" w:lineRule="exact"/>
       <w:ind w:left="2160" w:hanging="720"/>
+    </w:pPr>
+  </w:style>
+  <w:style w:type="paragraph" w:customStyle="1" w:styleId="XdQuoteList1">
+    <w:name w:val="Xd Quote List 1"/>
+    <w:basedOn w:val="Normal"/>
+    <w:qFormat/>
+    <w:pPr>
+      <w:spacing w:before="0" w:after="0" w:line="322" w:lineRule="exact"/>
+      <w:ind w:left="1440" w:right="720" w:hanging="720"/>
+    </w:pPr>
+  </w:style>
+  <w:style w:type="paragraph" w:customStyle="1" w:styleId="XdQuoteList2">
+    <w:name w:val="Xd Quote List 2"/>
+    <w:basedOn w:val="Normal"/>
+    <w:qFormat/>
+    <w:pPr>
+      <w:spacing w:before="0" w:after="0" w:line="322" w:lineRule="exact"/>
+      <w:ind w:left="2160" w:right="720" w:hanging="720"/>
+    </w:pPr>
+  </w:style>
+  <w:style w:type="paragraph" w:customStyle="1" w:styleId="XdQuoteList3">
+    <w:name w:val="Xd Quote List 3"/>
+    <w:basedOn w:val="Normal"/>
+    <w:qFormat/>
+    <w:pPr>
+      <w:spacing w:before="0" w:after="0" w:line="322" w:lineRule="exact"/>
+      <w:ind w:left="2880" w:right="720" w:hanging="720"/>
     </w:pPr>
   </w:style>
   <w:style w:type="paragraph" w:customStyle="1" w:styleId="XdQuote">

</xml_diff>